<commit_message>
Add Defi vault audit playground in core expertise section of a resume
</commit_message>
<xml_diff>
--- a/Ritik Verma Blockchain Engineer Resume.docx
+++ b/Ritik Verma Blockchain Engineer Resume.docx
@@ -92,7 +92,7 @@
     <w:p>
       <w:r>
         <w:pict w14:anchorId="6F9A2EB5">
-          <v:rect id="_x0000_i1025" style="width:0;height:1.5pt" o:hralign="center" o:hrstd="t" o:hr="t" fillcolor="#a0a0a0" stroked="f"/>
+          <v:rect id="_x0000_i1026" style="width:0;height:1.5pt" o:hralign="center" o:hrstd="t" o:hr="t" fillcolor="#a0a0a0" stroked="f"/>
         </w:pict>
       </w:r>
     </w:p>
@@ -140,7 +140,7 @@
     <w:p>
       <w:r>
         <w:pict w14:anchorId="08FEBDE8">
-          <v:rect id="_x0000_i1033" style="width:0;height:1.5pt" o:hralign="center" o:hrstd="t" o:hr="t" fillcolor="#a0a0a0" stroked="f"/>
+          <v:rect id="_x0000_i1027" style="width:0;height:1.5pt" o:hralign="center" o:hrstd="t" o:hr="t" fillcolor="#a0a0a0" stroked="f"/>
         </w:pict>
       </w:r>
     </w:p>
@@ -190,7 +190,24 @@
           <w:b/>
           <w:bCs/>
         </w:rPr>
-        <w:t xml:space="preserve">• Smart Contract Security &amp; Testing (Foundry)  </w:t>
+        <w:t xml:space="preserve">• Smart Contract Security, Testing &amp; Exploit Simulation (Foundry)  </w:t>
+      </w:r>
+    </w:p>
+    <w:p>
+      <w:pPr>
+        <w:rPr>
+          <w:rFonts w:asciiTheme="majorHAnsi" w:hAnsiTheme="majorHAnsi" w:cstheme="majorHAnsi"/>
+          <w:b/>
+          <w:bCs/>
+        </w:rPr>
+      </w:pPr>
+      <w:r>
+        <w:rPr>
+          <w:rFonts w:asciiTheme="majorHAnsi" w:hAnsiTheme="majorHAnsi" w:cstheme="majorHAnsi"/>
+          <w:b/>
+          <w:bCs/>
+        </w:rPr>
+        <w:t xml:space="preserve">• DeFi Protocol Concepts (Vaults, Share Accounting)  </w:t>
       </w:r>
     </w:p>
     <w:p>
@@ -293,13 +310,13 @@
           <w:b/>
           <w:bCs/>
         </w:rPr>
-        <w:t xml:space="preserve">• Upgradeable Contracts (Proxy Pattern)  </w:t>
+        <w:t>• Upgradeable Contracts (Proxy Pattern)</w:t>
       </w:r>
     </w:p>
     <w:p>
       <w:r>
         <w:pict w14:anchorId="2FC83357">
-          <v:rect id="_x0000_i1042" style="width:0;height:1.5pt" o:hralign="center" o:hrstd="t" o:hr="t" fillcolor="#a0a0a0" stroked="f"/>
+          <v:rect id="_x0000_i1028" style="width:0;height:1.5pt" o:hralign="center" o:hrstd="t" o:hr="t" fillcolor="#a0a0a0" stroked="f"/>
         </w:pict>
       </w:r>
     </w:p>
@@ -338,24 +355,31 @@
           <w:b/>
           <w:bCs/>
         </w:rPr>
-        <w:t xml:space="preserve">• Smart Contract Security Lab  </w:t>
-      </w:r>
-    </w:p>
-    <w:p>
-      <w:pPr>
-        <w:rPr>
-          <w:rFonts w:asciiTheme="majorHAnsi" w:hAnsiTheme="majorHAnsi" w:cstheme="majorHAnsi"/>
-          <w:b/>
-          <w:bCs/>
-        </w:rPr>
-      </w:pPr>
-      <w:r>
-        <w:rPr>
-          <w:rFonts w:asciiTheme="majorHAnsi" w:hAnsiTheme="majorHAnsi" w:cstheme="majorHAnsi"/>
-          <w:b/>
-          <w:bCs/>
-        </w:rPr>
-        <w:t>Built a hands-on security lab using Foundry to simulate real-world vulnerabilities (</w:t>
+        <w:t xml:space="preserve">• DeFi Vault Security &amp; Auditing </w:t>
+      </w:r>
+    </w:p>
+    <w:p>
+      <w:pPr>
+        <w:rPr>
+          <w:rFonts w:asciiTheme="majorHAnsi" w:hAnsiTheme="majorHAnsi" w:cstheme="majorHAnsi"/>
+          <w:b/>
+          <w:bCs/>
+        </w:rPr>
+      </w:pPr>
+      <w:r>
+        <w:rPr>
+          <w:b/>
+          <w:bCs/>
+        </w:rPr>
+        <w:br/>
+      </w:r>
+      <w:r>
+        <w:rPr>
+          <w:rFonts w:asciiTheme="majorHAnsi" w:hAnsiTheme="majorHAnsi" w:cstheme="majorHAnsi"/>
+          <w:b/>
+          <w:bCs/>
+        </w:rPr>
+        <w:t xml:space="preserve">Engineered and audited a DeFi vault system to simulate real-world vulnerabilities, including </w:t>
       </w:r>
       <w:proofErr w:type="spellStart"/>
       <w:r>
@@ -373,22 +397,160 @@
           <w:b/>
           <w:bCs/>
         </w:rPr>
-        <w:t xml:space="preserve">, access control, integer issues). Developed exploit contracts, validated attacks through tests, and implemented secure fixes.  </w:t>
-      </w:r>
-    </w:p>
-    <w:p>
-      <w:pPr>
-        <w:rPr>
-          <w:b/>
-          <w:bCs/>
-        </w:rPr>
-      </w:pPr>
-      <w:r>
-        <w:rPr>
-          <w:b/>
-          <w:bCs/>
-        </w:rPr>
-        <w:t>GitHub: https://github.com/Ritik505/smart-contract-security-lab</w:t>
+        <w:t xml:space="preserve"> and share inflation. Developed exploit contracts, reproduced attacks through test cases, and implemented validated secure fixes. Included a full audit report documenting findings, attack flows, and remediation. </w:t>
+      </w:r>
+    </w:p>
+    <w:p>
+      <w:pPr>
+        <w:rPr>
+          <w:b/>
+          <w:bCs/>
+        </w:rPr>
+      </w:pPr>
+      <w:r>
+        <w:rPr>
+          <w:b/>
+          <w:bCs/>
+        </w:rPr>
+        <w:br/>
+        <w:t xml:space="preserve">GitHub: </w:t>
+      </w:r>
+      <w:hyperlink r:id="rId9" w:history="1">
+        <w:r>
+          <w:rPr>
+            <w:rStyle w:val="Hyperlink"/>
+            <w:b/>
+            <w:bCs/>
+          </w:rPr>
+          <w:t>https://github.com/Ritik505/defi-vault-audit-play</w:t>
+        </w:r>
+        <w:r>
+          <w:rPr>
+            <w:rStyle w:val="Hyperlink"/>
+            <w:b/>
+            <w:bCs/>
+          </w:rPr>
+          <w:t>g</w:t>
+        </w:r>
+        <w:r>
+          <w:rPr>
+            <w:rStyle w:val="Hyperlink"/>
+            <w:b/>
+            <w:bCs/>
+          </w:rPr>
+          <w:t>round</w:t>
+        </w:r>
+      </w:hyperlink>
+      <w:r>
+        <w:rPr>
+          <w:b/>
+          <w:bCs/>
+        </w:rPr>
+        <w:t xml:space="preserve"> </w:t>
+      </w:r>
+    </w:p>
+    <w:p>
+      <w:pPr>
+        <w:rPr>
+          <w:b/>
+          <w:bCs/>
+        </w:rPr>
+      </w:pPr>
+    </w:p>
+    <w:p>
+      <w:pPr>
+        <w:rPr>
+          <w:b/>
+          <w:bCs/>
+        </w:rPr>
+      </w:pPr>
+      <w:r>
+        <w:rPr>
+          <w:b/>
+          <w:bCs/>
+        </w:rPr>
+        <w:t>•</w:t>
+      </w:r>
+      <w:r>
+        <w:rPr>
+          <w:b/>
+          <w:bCs/>
+        </w:rPr>
+        <w:t xml:space="preserve"> Smart Contract Security &amp; Testing</w:t>
+      </w:r>
+      <w:r>
+        <w:rPr>
+          <w:b/>
+          <w:bCs/>
+        </w:rPr>
+        <w:t xml:space="preserve"> </w:t>
+      </w:r>
+    </w:p>
+    <w:p>
+      <w:pPr>
+        <w:rPr>
+          <w:rFonts w:asciiTheme="majorHAnsi" w:hAnsiTheme="majorHAnsi" w:cstheme="majorHAnsi"/>
+          <w:b/>
+          <w:bCs/>
+        </w:rPr>
+      </w:pPr>
+      <w:r>
+        <w:rPr>
+          <w:rFonts w:asciiTheme="majorHAnsi" w:hAnsiTheme="majorHAnsi" w:cstheme="majorHAnsi"/>
+          <w:b/>
+          <w:bCs/>
+        </w:rPr>
+        <w:t>Engineered smart contract security testing using Foundry to simulate vulnerabilities (</w:t>
+      </w:r>
+      <w:proofErr w:type="spellStart"/>
+      <w:r>
+        <w:rPr>
+          <w:rFonts w:asciiTheme="majorHAnsi" w:hAnsiTheme="majorHAnsi" w:cstheme="majorHAnsi"/>
+          <w:b/>
+          <w:bCs/>
+        </w:rPr>
+        <w:t>reentrancy</w:t>
+      </w:r>
+      <w:proofErr w:type="spellEnd"/>
+      <w:r>
+        <w:rPr>
+          <w:rFonts w:asciiTheme="majorHAnsi" w:hAnsiTheme="majorHAnsi" w:cstheme="majorHAnsi"/>
+          <w:b/>
+          <w:bCs/>
+        </w:rPr>
+        <w:t>, access control, integer issues). Developed exploit contracts, validated attacks, and implemented secure fixes.</w:t>
+      </w:r>
+    </w:p>
+    <w:p>
+      <w:pPr>
+        <w:rPr>
+          <w:b/>
+          <w:bCs/>
+        </w:rPr>
+      </w:pPr>
+      <w:r>
+        <w:rPr>
+          <w:b/>
+          <w:bCs/>
+        </w:rPr>
+        <w:t xml:space="preserve">GitHub: </w:t>
+      </w:r>
+      <w:hyperlink r:id="rId10" w:history="1">
+        <w:r>
+          <w:rPr>
+            <w:rStyle w:val="Hyperlink"/>
+            <w:b/>
+            <w:bCs/>
+          </w:rPr>
+          <w:t>https://github.com/Ritik505/smart-contract-security-lab</w:t>
+        </w:r>
+      </w:hyperlink>
+      <w:r>
+        <w:rPr>
+          <w:b/>
+          <w:bCs/>
+        </w:rPr>
+        <w:t xml:space="preserve"> </w:t>
       </w:r>
     </w:p>
     <w:p>
@@ -443,7 +605,24 @@
           <w:b/>
           <w:bCs/>
         </w:rPr>
-        <w:t>GitHub: https://github.com/Ritik505/Foundry-Gas-Optimization</w:t>
+        <w:t xml:space="preserve">GitHub: </w:t>
+      </w:r>
+      <w:hyperlink r:id="rId11" w:history="1">
+        <w:r>
+          <w:rPr>
+            <w:rStyle w:val="Hyperlink"/>
+            <w:b/>
+            <w:bCs/>
+          </w:rPr>
+          <w:t>https://github.com/Ritik505/Foundry-Gas-Optimization</w:t>
+        </w:r>
+      </w:hyperlink>
+      <w:r>
+        <w:rPr>
+          <w:b/>
+          <w:bCs/>
+        </w:rPr>
+        <w:t xml:space="preserve"> </w:t>
       </w:r>
     </w:p>
     <w:p>
@@ -564,7 +743,7 @@
     <w:p>
       <w:r>
         <w:pict w14:anchorId="2F35700E">
-          <v:rect id="_x0000_i1038" style="width:0;height:1.5pt" o:hralign="center" o:bullet="t" o:hrstd="t" o:hr="t" fillcolor="#a0a0a0" stroked="f"/>
+          <v:rect id="_x0000_i1029" style="width:0;height:1.5pt" o:hralign="center" o:bullet="t" o:hrstd="t" o:hr="t" fillcolor="#a0a0a0" stroked="f"/>
         </w:pict>
       </w:r>
     </w:p>
@@ -698,7 +877,7 @@
       <w:r>
         <w:t xml:space="preserve"> </w:t>
       </w:r>
-      <w:hyperlink r:id="rId9" w:history="1">
+      <w:hyperlink r:id="rId12" w:history="1">
         <w:r>
           <w:rPr>
             <w:rStyle w:val="Hyperlink"/>
@@ -779,7 +958,7 @@
         </w:rPr>
         <w:t xml:space="preserve">Live: </w:t>
       </w:r>
-      <w:hyperlink r:id="rId10" w:tgtFrame="_new" w:history="1">
+      <w:hyperlink r:id="rId13" w:tgtFrame="_new" w:history="1">
         <w:r>
           <w:rPr>
             <w:rStyle w:val="Hyperlink"/>
@@ -861,7 +1040,7 @@
         </w:rPr>
         <w:t xml:space="preserve"> </w:t>
       </w:r>
-      <w:hyperlink r:id="rId11" w:history="1">
+      <w:hyperlink r:id="rId14" w:history="1">
         <w:r>
           <w:rPr>
             <w:rStyle w:val="Hyperlink"/>
@@ -988,7 +1167,7 @@
         </w:rPr>
         <w:t xml:space="preserve"> </w:t>
       </w:r>
-      <w:hyperlink r:id="rId12" w:history="1">
+      <w:hyperlink r:id="rId15" w:history="1">
         <w:r>
           <w:rPr>
             <w:rStyle w:val="Hyperlink"/>
@@ -1033,7 +1212,7 @@
     <w:p>
       <w:r>
         <w:pict w14:anchorId="2E666414">
-          <v:rect id="_x0000_i1028" style="width:0;height:1.5pt" o:hralign="center" o:hrstd="t" o:hr="t" fillcolor="#a0a0a0" stroked="f"/>
+          <v:rect id="_x0000_i1030" style="width:0;height:1.5pt" o:hralign="center" o:hrstd="t" o:hr="t" fillcolor="#a0a0a0" stroked="f"/>
         </w:pict>
       </w:r>
     </w:p>
@@ -1068,7 +1247,7 @@
     <w:p>
       <w:r>
         <w:pict w14:anchorId="291A1415">
-          <v:rect id="_x0000_i1029" style="width:0;height:1.5pt" o:hralign="center" o:hrstd="t" o:hr="t" fillcolor="#a0a0a0" stroked="f"/>
+          <v:rect id="_x0000_i1031" style="width:0;height:1.5pt" o:hralign="center" o:hrstd="t" o:hr="t" fillcolor="#a0a0a0" stroked="f"/>
         </w:pict>
       </w:r>
     </w:p>
@@ -2054,7 +2233,6 @@
   <w:style w:type="character" w:default="1" w:styleId="DefaultParagraphFont">
     <w:name w:val="Default Paragraph Font"/>
     <w:uiPriority w:val="1"/>
-    <w:semiHidden/>
     <w:unhideWhenUsed/>
   </w:style>
   <w:style w:type="table" w:default="1" w:styleId="TableNormal">

</xml_diff>

<commit_message>
Add defi-oracle-manipulation-playground in resume core expertise section
</commit_message>
<xml_diff>
--- a/Ritik Verma Blockchain Engineer Resume.docx
+++ b/Ritik Verma Blockchain Engineer Resume.docx
@@ -355,65 +355,80 @@
           <w:b/>
           <w:bCs/>
         </w:rPr>
-        <w:t xml:space="preserve">• DeFi Vault Security &amp; Auditing </w:t>
-      </w:r>
-    </w:p>
-    <w:p>
-      <w:pPr>
-        <w:rPr>
-          <w:rFonts w:asciiTheme="majorHAnsi" w:hAnsiTheme="majorHAnsi" w:cstheme="majorHAnsi"/>
-          <w:b/>
-          <w:bCs/>
-        </w:rPr>
-      </w:pPr>
-      <w:r>
-        <w:rPr>
-          <w:b/>
-          <w:bCs/>
-        </w:rPr>
-        <w:br/>
-      </w:r>
-      <w:r>
-        <w:rPr>
-          <w:rFonts w:asciiTheme="majorHAnsi" w:hAnsiTheme="majorHAnsi" w:cstheme="majorHAnsi"/>
-          <w:b/>
-          <w:bCs/>
-        </w:rPr>
-        <w:t xml:space="preserve">Engineered and audited a DeFi vault system to simulate real-world vulnerabilities, including </w:t>
+        <w:t xml:space="preserve">• Oracle Manipulation Security &amp; </w:t>
       </w:r>
       <w:proofErr w:type="spellStart"/>
       <w:r>
         <w:rPr>
-          <w:rFonts w:asciiTheme="majorHAnsi" w:hAnsiTheme="majorHAnsi" w:cstheme="majorHAnsi"/>
-          <w:b/>
-          <w:bCs/>
-        </w:rPr>
-        <w:t>reentrancy</w:t>
+          <w:b/>
+          <w:bCs/>
+        </w:rPr>
+        <w:t>Defense</w:t>
       </w:r>
       <w:proofErr w:type="spellEnd"/>
       <w:r>
         <w:rPr>
-          <w:rFonts w:asciiTheme="majorHAnsi" w:hAnsiTheme="majorHAnsi" w:cstheme="majorHAnsi"/>
-          <w:b/>
-          <w:bCs/>
-        </w:rPr>
-        <w:t xml:space="preserve"> and share inflation. Developed exploit contracts, reproduced attacks through test cases, and implemented validated secure fixes. Included a full audit report documenting findings, attack flows, and remediation. </w:t>
-      </w:r>
-    </w:p>
-    <w:p>
-      <w:pPr>
-        <w:rPr>
-          <w:b/>
-          <w:bCs/>
-        </w:rPr>
-      </w:pPr>
-      <w:r>
-        <w:rPr>
-          <w:b/>
-          <w:bCs/>
-        </w:rPr>
-        <w:br/>
+          <w:b/>
+          <w:bCs/>
+        </w:rPr>
+        <w:t xml:space="preserve">  </w:t>
+      </w:r>
+    </w:p>
+    <w:p>
+      <w:pPr>
+        <w:rPr>
+          <w:rFonts w:asciiTheme="majorHAnsi" w:hAnsiTheme="majorHAnsi" w:cstheme="majorHAnsi"/>
+          <w:b/>
+          <w:bCs/>
+        </w:rPr>
+      </w:pPr>
+      <w:r>
+        <w:rPr>
+          <w:rFonts w:asciiTheme="majorHAnsi" w:hAnsiTheme="majorHAnsi" w:cstheme="majorHAnsi"/>
+          <w:b/>
+          <w:bCs/>
+        </w:rPr>
+        <w:t xml:space="preserve">Engineered a DeFi lending protocol to simulate oracle price manipulation vulnerabilities. Demonstrated exploit scenarios by manipulating DEX-based pricing and validating attacks through reproducible Foundry tests. Implemented layered </w:t>
+      </w:r>
+      <w:proofErr w:type="spellStart"/>
+      <w:r>
+        <w:rPr>
+          <w:rFonts w:asciiTheme="majorHAnsi" w:hAnsiTheme="majorHAnsi" w:cstheme="majorHAnsi"/>
+          <w:b/>
+          <w:bCs/>
+        </w:rPr>
+        <w:t>defenses</w:t>
+      </w:r>
+      <w:proofErr w:type="spellEnd"/>
+      <w:r>
+        <w:rPr>
+          <w:rFonts w:asciiTheme="majorHAnsi" w:hAnsiTheme="majorHAnsi" w:cstheme="majorHAnsi"/>
+          <w:b/>
+          <w:bCs/>
+        </w:rPr>
+        <w:t xml:space="preserve"> including TWAP, multi-source oracle validation, price deviation checks, and LTV enforcement. Included a full audit-style report documenting exploit flow, root cause, and remediation.  </w:t>
+      </w:r>
+    </w:p>
+    <w:p>
+      <w:pPr>
+        <w:rPr>
+          <w:b/>
+          <w:bCs/>
+        </w:rPr>
+      </w:pPr>
+      <w:r>
+        <w:rPr>
+          <w:b/>
+          <w:bCs/>
+        </w:rPr>
         <w:t xml:space="preserve">GitHub: </w:t>
+      </w:r>
+      <w:r>
+        <w:rPr>
+          <w:b/>
+          <w:bCs/>
+        </w:rPr>
+        <w:t xml:space="preserve"> </w:t>
       </w:r>
       <w:hyperlink r:id="rId9" w:history="1">
         <w:r>
@@ -422,7 +437,7 @@
             <w:b/>
             <w:bCs/>
           </w:rPr>
-          <w:t>https://github.com/Ritik505/defi-vault-audit-play</w:t>
+          <w:t>https://github.com/Ritik505/defi-oracle-manipulation-playg</w:t>
         </w:r>
         <w:r>
           <w:rPr>
@@ -430,7 +445,7 @@
             <w:b/>
             <w:bCs/>
           </w:rPr>
-          <w:t>g</w:t>
+          <w:t>r</w:t>
         </w:r>
         <w:r>
           <w:rPr>
@@ -438,7 +453,7 @@
             <w:b/>
             <w:bCs/>
           </w:rPr>
-          <w:t>round</w:t>
+          <w:t>ound</w:t>
         </w:r>
       </w:hyperlink>
       <w:r>
@@ -469,6 +484,103 @@
           <w:b/>
           <w:bCs/>
         </w:rPr>
+        <w:t xml:space="preserve">• DeFi Vault Security &amp; Auditing </w:t>
+      </w:r>
+    </w:p>
+    <w:p>
+      <w:pPr>
+        <w:rPr>
+          <w:b/>
+          <w:bCs/>
+        </w:rPr>
+      </w:pPr>
+      <w:r>
+        <w:rPr>
+          <w:b/>
+          <w:bCs/>
+        </w:rPr>
+        <w:br/>
+      </w:r>
+      <w:r>
+        <w:rPr>
+          <w:rFonts w:asciiTheme="majorHAnsi" w:hAnsiTheme="majorHAnsi" w:cstheme="majorHAnsi"/>
+          <w:b/>
+          <w:bCs/>
+        </w:rPr>
+        <w:t xml:space="preserve">Engineered and audited a DeFi vault system to simulate real-world vulnerabilities, including </w:t>
+      </w:r>
+      <w:proofErr w:type="spellStart"/>
+      <w:r>
+        <w:rPr>
+          <w:rFonts w:asciiTheme="majorHAnsi" w:hAnsiTheme="majorHAnsi" w:cstheme="majorHAnsi"/>
+          <w:b/>
+          <w:bCs/>
+        </w:rPr>
+        <w:t>reentrancy</w:t>
+      </w:r>
+      <w:proofErr w:type="spellEnd"/>
+      <w:r>
+        <w:rPr>
+          <w:rFonts w:asciiTheme="majorHAnsi" w:hAnsiTheme="majorHAnsi" w:cstheme="majorHAnsi"/>
+          <w:b/>
+          <w:bCs/>
+        </w:rPr>
+        <w:t xml:space="preserve"> and share inflation. Developed exploit contracts, reproduced attacks through test cases, and implemented validated secure fixes. Included a full audit report documenting findings, attack flows, and remediation. </w:t>
+      </w:r>
+    </w:p>
+    <w:p>
+      <w:pPr>
+        <w:rPr>
+          <w:b/>
+          <w:bCs/>
+        </w:rPr>
+      </w:pPr>
+      <w:r>
+        <w:rPr>
+          <w:b/>
+          <w:bCs/>
+        </w:rPr>
+        <w:br/>
+        <w:t xml:space="preserve">GitHub: </w:t>
+      </w:r>
+      <w:hyperlink r:id="rId10" w:history="1">
+        <w:r>
+          <w:rPr>
+            <w:rStyle w:val="Hyperlink"/>
+            <w:b/>
+            <w:bCs/>
+          </w:rPr>
+          <w:t>https://github.com/Ritik505/defi-vault-audit-playground</w:t>
+        </w:r>
+      </w:hyperlink>
+      <w:r>
+        <w:rPr>
+          <w:b/>
+          <w:bCs/>
+        </w:rPr>
+        <w:t xml:space="preserve"> </w:t>
+      </w:r>
+    </w:p>
+    <w:p>
+      <w:pPr>
+        <w:rPr>
+          <w:b/>
+          <w:bCs/>
+        </w:rPr>
+      </w:pPr>
+    </w:p>
+    <w:p>
+      <w:pPr>
+        <w:rPr>
+          <w:b/>
+          <w:bCs/>
+        </w:rPr>
+      </w:pPr>
+      <w:r>
+        <w:rPr>
+          <w:b/>
+          <w:bCs/>
+        </w:rPr>
         <w:t>•</w:t>
       </w:r>
       <w:r>
@@ -535,7 +647,7 @@
         </w:rPr>
         <w:t xml:space="preserve">GitHub: </w:t>
       </w:r>
-      <w:hyperlink r:id="rId10" w:history="1">
+      <w:hyperlink r:id="rId11" w:history="1">
         <w:r>
           <w:rPr>
             <w:rStyle w:val="Hyperlink"/>
@@ -607,7 +719,7 @@
         </w:rPr>
         <w:t xml:space="preserve">GitHub: </w:t>
       </w:r>
-      <w:hyperlink r:id="rId11" w:history="1">
+      <w:hyperlink r:id="rId12" w:history="1">
         <w:r>
           <w:rPr>
             <w:rStyle w:val="Hyperlink"/>
@@ -877,7 +989,7 @@
       <w:r>
         <w:t xml:space="preserve"> </w:t>
       </w:r>
-      <w:hyperlink r:id="rId12" w:history="1">
+      <w:hyperlink r:id="rId13" w:history="1">
         <w:r>
           <w:rPr>
             <w:rStyle w:val="Hyperlink"/>
@@ -958,7 +1070,7 @@
         </w:rPr>
         <w:t xml:space="preserve">Live: </w:t>
       </w:r>
-      <w:hyperlink r:id="rId13" w:tgtFrame="_new" w:history="1">
+      <w:hyperlink r:id="rId14" w:tgtFrame="_new" w:history="1">
         <w:r>
           <w:rPr>
             <w:rStyle w:val="Hyperlink"/>
@@ -1040,7 +1152,7 @@
         </w:rPr>
         <w:t xml:space="preserve"> </w:t>
       </w:r>
-      <w:hyperlink r:id="rId14" w:history="1">
+      <w:hyperlink r:id="rId15" w:history="1">
         <w:r>
           <w:rPr>
             <w:rStyle w:val="Hyperlink"/>
@@ -1167,7 +1279,7 @@
         </w:rPr>
         <w:t xml:space="preserve"> </w:t>
       </w:r>
-      <w:hyperlink r:id="rId15" w:history="1">
+      <w:hyperlink r:id="rId16" w:history="1">
         <w:r>
           <w:rPr>
             <w:rStyle w:val="Hyperlink"/>
@@ -2233,6 +2345,7 @@
   <w:style w:type="character" w:default="1" w:styleId="DefaultParagraphFont">
     <w:name w:val="Default Paragraph Font"/>
     <w:uiPriority w:val="1"/>
+    <w:semiHidden/>
     <w:unhideWhenUsed/>
   </w:style>
   <w:style w:type="table" w:default="1" w:styleId="TableNormal">

</xml_diff>

<commit_message>
Add netfotech internship at experience section of resume
</commit_message>
<xml_diff>
--- a/Ritik Verma Blockchain Engineer Resume.docx
+++ b/Ritik Verma Blockchain Engineer Resume.docx
@@ -139,11 +139,77 @@
     </w:p>
     <w:p>
       <w:r>
-        <w:pict w14:anchorId="08FEBDE8">
-          <v:rect id="_x0000_i1027" style="width:0;height:1.5pt" o:hralign="center" o:hrstd="t" o:hr="t" fillcolor="#a0a0a0" stroked="f"/>
+        <w:pict w14:anchorId="146A6D52">
+          <v:rect id="_x0000_i1042" style="width:0;height:1.5pt" o:hralign="center" o:bullet="t" o:hrstd="t" o:hr="t" fillcolor="#a0a0a0" stroked="f"/>
         </w:pict>
       </w:r>
     </w:p>
+    <w:p/>
+    <w:p>
+      <w:pPr>
+        <w:rPr>
+          <w:b/>
+          <w:bCs/>
+        </w:rPr>
+      </w:pPr>
+      <w:r>
+        <w:rPr>
+          <w:b/>
+          <w:bCs/>
+        </w:rPr>
+        <w:t>Experience</w:t>
+      </w:r>
+    </w:p>
+    <w:p>
+      <w:pPr>
+        <w:rPr>
+          <w:b/>
+          <w:bCs/>
+        </w:rPr>
+      </w:pPr>
+      <w:r>
+        <w:rPr>
+          <w:b/>
+          <w:bCs/>
+        </w:rPr>
+        <w:t>Blockchain Developer Intern</w:t>
+      </w:r>
+    </w:p>
+    <w:p>
+      <w:pPr>
+        <w:rPr>
+          <w:rFonts w:asciiTheme="majorHAnsi" w:hAnsiTheme="majorHAnsi" w:cstheme="majorHAnsi"/>
+          <w:b/>
+          <w:bCs/>
+        </w:rPr>
+      </w:pPr>
+      <w:proofErr w:type="spellStart"/>
+      <w:r>
+        <w:rPr>
+          <w:rFonts w:asciiTheme="majorHAnsi" w:hAnsiTheme="majorHAnsi" w:cstheme="majorHAnsi"/>
+          <w:b/>
+          <w:bCs/>
+        </w:rPr>
+        <w:t>Netfotech</w:t>
+      </w:r>
+      <w:proofErr w:type="spellEnd"/>
+      <w:r>
+        <w:rPr>
+          <w:rFonts w:asciiTheme="majorHAnsi" w:hAnsiTheme="majorHAnsi" w:cstheme="majorHAnsi"/>
+          <w:b/>
+          <w:bCs/>
+        </w:rPr>
+        <w:t xml:space="preserve"> Solutions | July 2026 – Present</w:t>
+      </w:r>
+    </w:p>
+    <w:p>
+      <w:r>
+        <w:pict w14:anchorId="021D1D92">
+          <v:rect id="_x0000_i1038" style="width:0;height:1.5pt" o:hralign="center" o:hrstd="t" o:hr="t" fillcolor="#a0a0a0" stroked="f"/>
+        </w:pict>
+      </w:r>
+    </w:p>
+    <w:p/>
     <w:p>
       <w:pPr>
         <w:rPr>
@@ -437,23 +503,7 @@
             <w:b/>
             <w:bCs/>
           </w:rPr>
-          <w:t>https://github.com/Ritik505/defi-oracle-manipulation-playg</w:t>
-        </w:r>
-        <w:r>
-          <w:rPr>
-            <w:rStyle w:val="Hyperlink"/>
-            <w:b/>
-            <w:bCs/>
-          </w:rPr>
-          <w:t>r</w:t>
-        </w:r>
-        <w:r>
-          <w:rPr>
-            <w:rStyle w:val="Hyperlink"/>
-            <w:b/>
-            <w:bCs/>
-          </w:rPr>
-          <w:t>ound</w:t>
+          <w:t>https://github.com/Ritik505/defi-oracle-manipulation-playground</w:t>
         </w:r>
       </w:hyperlink>
       <w:r>
@@ -774,7 +824,7 @@
           <w:b/>
           <w:bCs/>
         </w:rPr>
-        <w:t xml:space="preserve">Implemented upgradeable contracts using ERC1967 proxy pattern with </w:t>
+        <w:t xml:space="preserve">Implemented upgradeable smart contracts using the ERC-1967 proxy pattern with </w:t>
       </w:r>
       <w:proofErr w:type="spellStart"/>
       <w:r>
@@ -792,16 +842,8 @@
           <w:b/>
           <w:bCs/>
         </w:rPr>
-        <w:t>, enabling secure contract upgrades while preserving state.</w:t>
-      </w:r>
-    </w:p>
-    <w:p>
-      <w:pPr>
-        <w:rPr>
-          <w:b/>
-          <w:bCs/>
-        </w:rPr>
-      </w:pPr>
+        <w:t>, enabling contract upgrades while preserving on-chain state.</w:t>
+      </w:r>
     </w:p>
     <w:p>
       <w:pPr>
@@ -1397,7 +1439,7 @@
         </w:numPr>
       </w:pPr>
       <w:r>
-        <w:t>Active contributor to open-source blockchain projects</w:t>
+        <w:t>Open-source blockchain developer building and publishing independent smart contract and Web3 projects.</w:t>
       </w:r>
     </w:p>
     <w:p>
@@ -1432,6 +1474,16 @@
   <w:numPicBullet w:numPicBulletId="0">
     <w:pict>
       <v:rect id="_x0000_i1025" style="width:0;height:1.5pt" o:hralign="center" o:bullet="t" o:hrstd="t" o:hr="t" fillcolor="#a0a0a0" stroked="f"/>
+    </w:pict>
+  </w:numPicBullet>
+  <w:numPicBullet w:numPicBulletId="1">
+    <w:pict>
+      <v:rect id="_x0000_i1026" style="width:0;height:1.5pt" o:hralign="center" o:bullet="t" o:hrstd="t" o:hr="t" fillcolor="#a0a0a0" stroked="f"/>
+    </w:pict>
+  </w:numPicBullet>
+  <w:numPicBullet w:numPicBulletId="2">
+    <w:pict>
+      <v:rect id="_x0000_i1027" style="width:0;height:1.5pt" o:hralign="center" o:bullet="t" o:hrstd="t" o:hr="t" fillcolor="#a0a0a0" stroked="f"/>
     </w:pict>
   </w:numPicBullet>
   <w:abstractNum w:abstractNumId="0" w15:restartNumberingAfterBreak="0">
@@ -2141,7 +2193,7 @@
   <w:style w:type="paragraph" w:default="1" w:styleId="Normal">
     <w:name w:val="Normal"/>
     <w:qFormat/>
-    <w:rsid w:val="003E4233"/>
+    <w:rsid w:val="00B87124"/>
   </w:style>
   <w:style w:type="paragraph" w:styleId="Heading1">
     <w:name w:val="heading 1"/>
@@ -2345,7 +2397,6 @@
   <w:style w:type="character" w:default="1" w:styleId="DefaultParagraphFont">
     <w:name w:val="Default Paragraph Font"/>
     <w:uiPriority w:val="1"/>
-    <w:semiHidden/>
     <w:unhideWhenUsed/>
   </w:style>
   <w:style w:type="table" w:default="1" w:styleId="TableNormal">

</xml_diff>